<commit_message>
Add EXCO report, Audit HR, leave attestations, and related UX fixes.
Includes KPI summary with prev-month values and trend colors, attestation letterheads, dependants birth-date picker, and menu permission tightening.

Co-authored-by: Cursor <cursoragent@cursor.com>
</commit_message>
<xml_diff>
--- a/Excel/templates/attestations/Attestation de service .docx
+++ b/Excel/templates/attestations/Attestation de service .docx
@@ -1535,32 +1535,6 @@
                         <w:p>
                           <w:pPr>
                             <w:pStyle w:val="Tradingname"/>
-                            <w:tabs>
-                              <w:tab w:val="left" w:pos="434"/>
-                            </w:tabs>
-                            <w:spacing w:line="240" w:lineRule="auto"/>
-                            <w:rPr>
-                              <w:rFonts w:ascii="Times New Roman" w:hAnsi="Times New Roman"/>
-                              <w:sz w:val="12"/>
-                              <w:szCs w:val="12"/>
-                              <w:lang w:val="en-US"/>
-                            </w:rPr>
-                          </w:pPr>
-                          <w:r>
-                            <w:rPr>
-                              <w:rFonts w:ascii="Times New Roman" w:hAnsi="Times New Roman"/>
-                              <w:sz w:val="12"/>
-                              <w:szCs w:val="12"/>
-                              <w:lang w:val="en-US"/>
-                            </w:rPr>
-                            <w:t>PPC Barnet DRC Manufacturing SA</w:t>
-                          </w:r>
-                        </w:p>
-                        <w:p>
-                          <w:pPr>
-                            <w:tabs>
-                              <w:tab w:val="left" w:pos="434"/>
-                            </w:tabs>
                             <w:spacing w:after="0" w:line="240" w:lineRule="auto"/>
                             <w:rPr>
                               <w:rFonts w:ascii="Times New Roman" w:hAnsi="Times New Roman"/>
@@ -1576,14 +1550,11 @@
                               <w:szCs w:val="12"/>
                               <w:lang w:val="en-US"/>
                             </w:rPr>
-                            <w:t>63, av. Colonel Monjiba, Concession COTEX</w:t>
+                            <w:t xml:space="preserve">PPC Barnet DRC Manufacturing SA</w:t>
                           </w:r>
                         </w:p>
                         <w:p>
                           <w:pPr>
-                            <w:tabs>
-                              <w:tab w:val="left" w:pos="434"/>
-                            </w:tabs>
                             <w:spacing w:after="0" w:line="240" w:lineRule="auto"/>
                             <w:rPr>
                               <w:rFonts w:ascii="Times New Roman" w:hAnsi="Times New Roman"/>
@@ -1599,25 +1570,11 @@
                               <w:szCs w:val="12"/>
                               <w:lang w:val="en-US"/>
                             </w:rPr>
-                            <w:t>Kinshasa/</w:t>
+                            <w:t xml:space="preserve">5ᵉ étage, Immeuble la Promenade 2,</w:t>
                           </w:r>
-                          <w:proofErr w:type="spellStart"/>
-                          <w:r>
-                            <w:rPr>
-                              <w:rFonts w:ascii="Times New Roman" w:hAnsi="Times New Roman"/>
-                              <w:sz w:val="12"/>
-                              <w:szCs w:val="12"/>
-                              <w:lang w:val="en-US"/>
-                            </w:rPr>
-                            <w:t>Ngaliema</w:t>
-                          </w:r>
-                          <w:proofErr w:type="spellEnd"/>
                         </w:p>
                         <w:p>
                           <w:pPr>
-                            <w:tabs>
-                              <w:tab w:val="left" w:pos="434"/>
-                            </w:tabs>
                             <w:spacing w:after="0" w:line="240" w:lineRule="auto"/>
                             <w:rPr>
                               <w:rFonts w:ascii="Times New Roman" w:hAnsi="Times New Roman"/>
@@ -1633,49 +1590,11 @@
                               <w:szCs w:val="12"/>
                               <w:lang w:val="en-US"/>
                             </w:rPr>
-                            <w:t>D.R. Congo</w:t>
+                            <w:t xml:space="preserve">Croisement des avenues OUA et Massamba, Quartier  Basoko, Commune de Ngaliema.</w:t>
                           </w:r>
                         </w:p>
                         <w:p>
                           <w:pPr>
-                            <w:tabs>
-                              <w:tab w:val="left" w:pos="434"/>
-                            </w:tabs>
-                            <w:spacing w:after="0" w:line="240" w:lineRule="auto"/>
-                            <w:rPr>
-                              <w:rFonts w:ascii="Times New Roman" w:hAnsi="Times New Roman" w:cs="Times New Roman"/>
-                              <w:sz w:val="12"/>
-                              <w:szCs w:val="12"/>
-                              <w:lang w:val="en-US"/>
-                            </w:rPr>
-                          </w:pPr>
-                          <w:r>
-                            <w:rPr>
-                              <w:rFonts w:ascii="Times New Roman" w:hAnsi="Times New Roman"/>
-                              <w:sz w:val="12"/>
-                              <w:szCs w:val="12"/>
-                              <w:lang w:val="en-US"/>
-                            </w:rPr>
-                            <w:t xml:space="preserve">Email: </w:t>
-                          </w:r>
-                          <w:hyperlink r:id="rId2" w:history="1">
-                            <w:r>
-                              <w:rPr>
-                                <w:rStyle w:val="Hyperlink"/>
-                                <w:rFonts w:ascii="Times New Roman" w:hAnsi="Times New Roman" w:cs="Times New Roman"/>
-                                <w:sz w:val="12"/>
-                                <w:szCs w:val="12"/>
-                                <w:lang w:val="en-US"/>
-                              </w:rPr>
-                              <w:t>Reception.HQ@ppcdrc.cd</w:t>
-                            </w:r>
-                          </w:hyperlink>
-                        </w:p>
-                        <w:p>
-                          <w:pPr>
-                            <w:tabs>
-                              <w:tab w:val="left" w:pos="434"/>
-                            </w:tabs>
                             <w:spacing w:after="0" w:line="240" w:lineRule="auto"/>
                             <w:rPr>
                               <w:rFonts w:ascii="Times New Roman" w:hAnsi="Times New Roman"/>
@@ -1691,8 +1610,19 @@
                               <w:szCs w:val="12"/>
                               <w:lang w:val="en-US"/>
                             </w:rPr>
-                            <w:t>Tel</w:t>
+                            <w:t xml:space="preserve">Email : Reception.HQ@ppcdrc.cd</w:t>
                           </w:r>
+                        </w:p>
+                        <w:p>
+                          <w:pPr>
+                            <w:spacing w:after="0" w:line="240" w:lineRule="auto"/>
+                            <w:rPr>
+                              <w:rFonts w:ascii="Times New Roman" w:hAnsi="Times New Roman"/>
+                              <w:sz w:val="12"/>
+                              <w:szCs w:val="12"/>
+                              <w:lang w:val="en-US"/>
+                            </w:rPr>
+                          </w:pPr>
                           <w:r>
                             <w:rPr>
                               <w:rFonts w:ascii="Times New Roman" w:hAnsi="Times New Roman"/>
@@ -1700,8 +1630,20 @@
                               <w:szCs w:val="12"/>
                               <w:lang w:val="en-US"/>
                             </w:rPr>
-                            <w:t xml:space="preserve">: </w:t>
+                            <w:t xml:space="preserve">Tel  +243 899922864</w:t>
                           </w:r>
+                        </w:p>
+                        <w:p>
+                          <w:pPr>
+                            <w:pStyle w:val="Address"/>
+                            <w:spacing w:after="0" w:line="240" w:lineRule="auto"/>
+                            <w:rPr>
+                              <w:rFonts w:ascii="Times New Roman" w:hAnsi="Times New Roman"/>
+                              <w:sz w:val="12"/>
+                              <w:szCs w:val="12"/>
+                              <w:lang w:val="en-US"/>
+                            </w:rPr>
+                          </w:pPr>
                           <w:r>
                             <w:rPr>
                               <w:rFonts w:ascii="Times New Roman" w:hAnsi="Times New Roman"/>
@@ -1709,20 +1651,18 @@
                               <w:szCs w:val="12"/>
                               <w:lang w:val="en-US"/>
                             </w:rPr>
-                            <w:t>+243 899922864</w:t>
+                            <w:t xml:space="preserve">IDNAT ID 01-C2301-N79031Q</w:t>
                           </w:r>
                         </w:p>
                         <w:p>
                           <w:pPr>
                             <w:pStyle w:val="Address"/>
-                            <w:tabs>
-                              <w:tab w:val="left" w:pos="284"/>
-                            </w:tabs>
-                            <w:spacing w:line="240" w:lineRule="auto"/>
+                            <w:spacing w:after="0" w:line="240" w:lineRule="auto"/>
                             <w:rPr>
                               <w:rFonts w:ascii="Times New Roman" w:hAnsi="Times New Roman"/>
                               <w:sz w:val="12"/>
                               <w:szCs w:val="12"/>
+                              <w:lang w:val="en-US"/>
                             </w:rPr>
                           </w:pPr>
                           <w:r>
@@ -1730,18 +1670,20 @@
                               <w:rFonts w:ascii="Times New Roman" w:hAnsi="Times New Roman"/>
                               <w:sz w:val="12"/>
                               <w:szCs w:val="12"/>
+                              <w:lang w:val="en-US"/>
                             </w:rPr>
-                            <w:t>IDNAT ID 01-C2301-N79031Q</w:t>
+                            <w:t xml:space="preserve">RCCM 14-B-01677</w:t>
                           </w:r>
                         </w:p>
                         <w:p>
                           <w:pPr>
                             <w:pStyle w:val="Address"/>
-                            <w:spacing w:line="240" w:lineRule="auto"/>
+                            <w:spacing w:after="0" w:line="240" w:lineRule="auto"/>
                             <w:rPr>
                               <w:rFonts w:ascii="Times New Roman" w:hAnsi="Times New Roman"/>
                               <w:sz w:val="12"/>
                               <w:szCs w:val="12"/>
+                              <w:lang w:val="en-US"/>
                             </w:rPr>
                           </w:pPr>
                           <w:r>
@@ -1749,37 +1691,9 @@
                               <w:rFonts w:ascii="Times New Roman" w:hAnsi="Times New Roman"/>
                               <w:sz w:val="12"/>
                               <w:szCs w:val="12"/>
+                              <w:lang w:val="en-US"/>
                             </w:rPr>
-                            <w:t>RCCM 14-B-01677</w:t>
-                          </w:r>
-                        </w:p>
-                        <w:p>
-                          <w:pPr>
-                            <w:pStyle w:val="Address"/>
-                            <w:spacing w:line="240" w:lineRule="auto"/>
-                            <w:rPr>
-                              <w:rFonts w:ascii="Times New Roman" w:hAnsi="Times New Roman"/>
-                              <w:sz w:val="12"/>
-                              <w:szCs w:val="12"/>
-                            </w:rPr>
-                          </w:pPr>
-                          <w:proofErr w:type="spellStart"/>
-                          <w:r>
-                            <w:rPr>
-                              <w:rFonts w:ascii="Times New Roman" w:hAnsi="Times New Roman"/>
-                              <w:sz w:val="12"/>
-                              <w:szCs w:val="12"/>
-                            </w:rPr>
-                            <w:t>Numéro</w:t>
-                          </w:r>
-                          <w:proofErr w:type="spellEnd"/>
-                          <w:r>
-                            <w:rPr>
-                              <w:rFonts w:ascii="Times New Roman" w:hAnsi="Times New Roman"/>
-                              <w:sz w:val="12"/>
-                              <w:szCs w:val="12"/>
-                            </w:rPr>
-                            <w:t xml:space="preserve"> impot A1402387L</w:t>
+                            <w:t xml:space="preserve">Numéro impot A1402387L</w:t>
                           </w:r>
                         </w:p>
                         <w:p>
@@ -1822,32 +1736,6 @@
                   <w:p>
                     <w:pPr>
                       <w:pStyle w:val="Tradingname"/>
-                      <w:tabs>
-                        <w:tab w:val="left" w:pos="434"/>
-                      </w:tabs>
-                      <w:spacing w:line="240" w:lineRule="auto"/>
-                      <w:rPr>
-                        <w:rFonts w:ascii="Times New Roman" w:hAnsi="Times New Roman"/>
-                        <w:sz w:val="12"/>
-                        <w:szCs w:val="12"/>
-                        <w:lang w:val="en-US"/>
-                      </w:rPr>
-                    </w:pPr>
-                    <w:r>
-                      <w:rPr>
-                        <w:rFonts w:ascii="Times New Roman" w:hAnsi="Times New Roman"/>
-                        <w:sz w:val="12"/>
-                        <w:szCs w:val="12"/>
-                        <w:lang w:val="en-US"/>
-                      </w:rPr>
-                      <w:t>PPC Barnet DRC Manufacturing SA</w:t>
-                    </w:r>
-                  </w:p>
-                  <w:p>
-                    <w:pPr>
-                      <w:tabs>
-                        <w:tab w:val="left" w:pos="434"/>
-                      </w:tabs>
                       <w:spacing w:after="0" w:line="240" w:lineRule="auto"/>
                       <w:rPr>
                         <w:rFonts w:ascii="Times New Roman" w:hAnsi="Times New Roman"/>
@@ -1863,14 +1751,11 @@
                         <w:szCs w:val="12"/>
                         <w:lang w:val="en-US"/>
                       </w:rPr>
-                      <w:t>63, av. Colonel Monjiba, Concession COTEX</w:t>
+                      <w:t xml:space="preserve">PPC Barnet DRC Manufacturing SA</w:t>
                     </w:r>
                   </w:p>
                   <w:p>
                     <w:pPr>
-                      <w:tabs>
-                        <w:tab w:val="left" w:pos="434"/>
-                      </w:tabs>
                       <w:spacing w:after="0" w:line="240" w:lineRule="auto"/>
                       <w:rPr>
                         <w:rFonts w:ascii="Times New Roman" w:hAnsi="Times New Roman"/>
@@ -1886,25 +1771,11 @@
                         <w:szCs w:val="12"/>
                         <w:lang w:val="en-US"/>
                       </w:rPr>
-                      <w:t>Kinshasa/</w:t>
+                      <w:t xml:space="preserve">5ᵉ étage, Immeuble la Promenade 2,</w:t>
                     </w:r>
-                    <w:proofErr w:type="spellStart"/>
-                    <w:r>
-                      <w:rPr>
-                        <w:rFonts w:ascii="Times New Roman" w:hAnsi="Times New Roman"/>
-                        <w:sz w:val="12"/>
-                        <w:szCs w:val="12"/>
-                        <w:lang w:val="en-US"/>
-                      </w:rPr>
-                      <w:t>Ngaliema</w:t>
-                    </w:r>
-                    <w:proofErr w:type="spellEnd"/>
                   </w:p>
                   <w:p>
                     <w:pPr>
-                      <w:tabs>
-                        <w:tab w:val="left" w:pos="434"/>
-                      </w:tabs>
                       <w:spacing w:after="0" w:line="240" w:lineRule="auto"/>
                       <w:rPr>
                         <w:rFonts w:ascii="Times New Roman" w:hAnsi="Times New Roman"/>
@@ -1920,62 +1791,11 @@
                         <w:szCs w:val="12"/>
                         <w:lang w:val="en-US"/>
                       </w:rPr>
-                      <w:t>D.R. Congo</w:t>
+                      <w:t xml:space="preserve">Croisement des avenues OUA et Massamba, Quartier  Basoko, Commune de Ngaliema.</w:t>
                     </w:r>
                   </w:p>
                   <w:p>
                     <w:pPr>
-                      <w:tabs>
-                        <w:tab w:val="left" w:pos="434"/>
-                      </w:tabs>
-                      <w:spacing w:after="0" w:line="240" w:lineRule="auto"/>
-                      <w:rPr>
-                        <w:rFonts w:ascii="Times New Roman" w:hAnsi="Times New Roman" w:cs="Times New Roman"/>
-                        <w:sz w:val="12"/>
-                        <w:szCs w:val="12"/>
-                        <w:lang w:val="en-US"/>
-                      </w:rPr>
-                    </w:pPr>
-                    <w:r>
-                      <w:rPr>
-                        <w:rFonts w:ascii="Times New Roman" w:hAnsi="Times New Roman"/>
-                        <w:sz w:val="12"/>
-                        <w:szCs w:val="12"/>
-                        <w:lang w:val="en-US"/>
-                      </w:rPr>
-                      <w:t xml:space="preserve">Email: </w:t>
-                    </w:r>
-                    <w:r>
-                      <w:fldChar w:fldCharType="begin"/>
-                    </w:r>
-                    <w:r>
-                      <w:rPr>
-                        <w:lang w:val="en-US"/>
-                      </w:rPr>
-                      <w:instrText>HYPERLINK "mailto:Reception.HQ@ppcdrc.cd"</w:instrText>
-                    </w:r>
-                    <w:r>
-                      <w:fldChar w:fldCharType="separate"/>
-                    </w:r>
-                    <w:r>
-                      <w:rPr>
-                        <w:rStyle w:val="Hyperlink"/>
-                        <w:rFonts w:ascii="Times New Roman" w:hAnsi="Times New Roman" w:cs="Times New Roman"/>
-                        <w:sz w:val="12"/>
-                        <w:szCs w:val="12"/>
-                        <w:lang w:val="en-US"/>
-                      </w:rPr>
-                      <w:t>Reception.HQ@ppcdrc.cd</w:t>
-                    </w:r>
-                    <w:r>
-                      <w:fldChar w:fldCharType="end"/>
-                    </w:r>
-                  </w:p>
-                  <w:p>
-                    <w:pPr>
-                      <w:tabs>
-                        <w:tab w:val="left" w:pos="434"/>
-                      </w:tabs>
                       <w:spacing w:after="0" w:line="240" w:lineRule="auto"/>
                       <w:rPr>
                         <w:rFonts w:ascii="Times New Roman" w:hAnsi="Times New Roman"/>
@@ -1991,8 +1811,19 @@
                         <w:szCs w:val="12"/>
                         <w:lang w:val="en-US"/>
                       </w:rPr>
-                      <w:t>Tel</w:t>
+                      <w:t xml:space="preserve">Email : Reception.HQ@ppcdrc.cd</w:t>
                     </w:r>
+                  </w:p>
+                  <w:p>
+                    <w:pPr>
+                      <w:spacing w:after="0" w:line="240" w:lineRule="auto"/>
+                      <w:rPr>
+                        <w:rFonts w:ascii="Times New Roman" w:hAnsi="Times New Roman"/>
+                        <w:sz w:val="12"/>
+                        <w:szCs w:val="12"/>
+                        <w:lang w:val="en-US"/>
+                      </w:rPr>
+                    </w:pPr>
                     <w:r>
                       <w:rPr>
                         <w:rFonts w:ascii="Times New Roman" w:hAnsi="Times New Roman"/>
@@ -2000,8 +1831,20 @@
                         <w:szCs w:val="12"/>
                         <w:lang w:val="en-US"/>
                       </w:rPr>
-                      <w:t xml:space="preserve">: </w:t>
+                      <w:t xml:space="preserve">Tel  +243 899922864</w:t>
                     </w:r>
+                  </w:p>
+                  <w:p>
+                    <w:pPr>
+                      <w:pStyle w:val="Address"/>
+                      <w:spacing w:after="0" w:line="240" w:lineRule="auto"/>
+                      <w:rPr>
+                        <w:rFonts w:ascii="Times New Roman" w:hAnsi="Times New Roman"/>
+                        <w:sz w:val="12"/>
+                        <w:szCs w:val="12"/>
+                        <w:lang w:val="en-US"/>
+                      </w:rPr>
+                    </w:pPr>
                     <w:r>
                       <w:rPr>
                         <w:rFonts w:ascii="Times New Roman" w:hAnsi="Times New Roman"/>
@@ -2009,20 +1852,18 @@
                         <w:szCs w:val="12"/>
                         <w:lang w:val="en-US"/>
                       </w:rPr>
-                      <w:t>+243 899922864</w:t>
+                      <w:t xml:space="preserve">IDNAT ID 01-C2301-N79031Q</w:t>
                     </w:r>
                   </w:p>
                   <w:p>
                     <w:pPr>
                       <w:pStyle w:val="Address"/>
-                      <w:tabs>
-                        <w:tab w:val="left" w:pos="284"/>
-                      </w:tabs>
-                      <w:spacing w:line="240" w:lineRule="auto"/>
+                      <w:spacing w:after="0" w:line="240" w:lineRule="auto"/>
                       <w:rPr>
                         <w:rFonts w:ascii="Times New Roman" w:hAnsi="Times New Roman"/>
                         <w:sz w:val="12"/>
                         <w:szCs w:val="12"/>
+                        <w:lang w:val="en-US"/>
                       </w:rPr>
                     </w:pPr>
                     <w:r>
@@ -2030,18 +1871,20 @@
                         <w:rFonts w:ascii="Times New Roman" w:hAnsi="Times New Roman"/>
                         <w:sz w:val="12"/>
                         <w:szCs w:val="12"/>
+                        <w:lang w:val="en-US"/>
                       </w:rPr>
-                      <w:t>IDNAT ID 01-C2301-N79031Q</w:t>
+                      <w:t xml:space="preserve">RCCM 14-B-01677</w:t>
                     </w:r>
                   </w:p>
                   <w:p>
                     <w:pPr>
                       <w:pStyle w:val="Address"/>
-                      <w:spacing w:line="240" w:lineRule="auto"/>
+                      <w:spacing w:after="0" w:line="240" w:lineRule="auto"/>
                       <w:rPr>
                         <w:rFonts w:ascii="Times New Roman" w:hAnsi="Times New Roman"/>
                         <w:sz w:val="12"/>
                         <w:szCs w:val="12"/>
+                        <w:lang w:val="en-US"/>
                       </w:rPr>
                     </w:pPr>
                     <w:r>
@@ -2049,37 +1892,9 @@
                         <w:rFonts w:ascii="Times New Roman" w:hAnsi="Times New Roman"/>
                         <w:sz w:val="12"/>
                         <w:szCs w:val="12"/>
+                        <w:lang w:val="en-US"/>
                       </w:rPr>
-                      <w:t>RCCM 14-B-01677</w:t>
-                    </w:r>
-                  </w:p>
-                  <w:p>
-                    <w:pPr>
-                      <w:pStyle w:val="Address"/>
-                      <w:spacing w:line="240" w:lineRule="auto"/>
-                      <w:rPr>
-                        <w:rFonts w:ascii="Times New Roman" w:hAnsi="Times New Roman"/>
-                        <w:sz w:val="12"/>
-                        <w:szCs w:val="12"/>
-                      </w:rPr>
-                    </w:pPr>
-                    <w:proofErr w:type="spellStart"/>
-                    <w:r>
-                      <w:rPr>
-                        <w:rFonts w:ascii="Times New Roman" w:hAnsi="Times New Roman"/>
-                        <w:sz w:val="12"/>
-                        <w:szCs w:val="12"/>
-                      </w:rPr>
-                      <w:t>Numéro</w:t>
-                    </w:r>
-                    <w:proofErr w:type="spellEnd"/>
-                    <w:r>
-                      <w:rPr>
-                        <w:rFonts w:ascii="Times New Roman" w:hAnsi="Times New Roman"/>
-                        <w:sz w:val="12"/>
-                        <w:szCs w:val="12"/>
-                      </w:rPr>
-                      <w:t xml:space="preserve"> impot A1402387L</w:t>
+                      <w:t xml:space="preserve">Numéro impot A1402387L</w:t>
                     </w:r>
                   </w:p>
                   <w:p>

</xml_diff>